<commit_message>
Ideeenbus: #7 Camerabewaking add-on (Reolink/UniFi/Frigate)
</commit_message>
<xml_diff>
--- a/ideenbus.docx
+++ b/ideenbus.docx
@@ -800,6 +800,105 @@
           </w:p>
         </w:tc>
       </w:tr>
+      <w:tr>
+        <w:tc>
+          <w:tcPr>
+            <w:tcW w:type="dxa" w:w="600"/>
+            <w:tcBorders>
+              <w:top w:val="single" w:color="CCCCCC" w:sz="1"/>
+              <w:left w:val="single" w:color="CCCCCC" w:sz="1"/>
+              <w:bottom w:val="single" w:color="CCCCCC" w:sz="1"/>
+              <w:right w:val="single" w:color="CCCCCC" w:sz="1"/>
+            </w:tcBorders>
+            <w:tcMar>
+              <w:top w:type="dxa" w:w="80"/>
+              <w:left w:type="dxa" w:w="120"/>
+              <w:bottom w:type="dxa" w:w="80"/>
+              <w:right w:type="dxa" w:w="120"/>
+            </w:tcMar>
+          </w:tcPr>
+          <w:p>
+            <w:r>
+              <w:rPr>
+                <w:b/>
+                <w:bCs/>
+              </w:rPr>
+              <w:t xml:space="preserve">7</w:t>
+            </w:r>
+          </w:p>
+        </w:tc>
+        <w:tc>
+          <w:tcPr>
+            <w:tcW w:type="dxa" w:w="2800"/>
+            <w:tcBorders>
+              <w:top w:val="single" w:color="CCCCCC" w:sz="1"/>
+              <w:left w:val="single" w:color="CCCCCC" w:sz="1"/>
+              <w:bottom w:val="single" w:color="CCCCCC" w:sz="1"/>
+              <w:right w:val="single" w:color="CCCCCC" w:sz="1"/>
+            </w:tcBorders>
+            <w:tcMar>
+              <w:top w:type="dxa" w:w="80"/>
+              <w:left w:type="dxa" w:w="120"/>
+              <w:bottom w:type="dxa" w:w="80"/>
+              <w:right w:type="dxa" w:w="120"/>
+            </w:tcMar>
+          </w:tcPr>
+          <w:p>
+            <w:r>
+              <w:rPr>
+                <w:b/>
+                <w:bCs/>
+              </w:rPr>
+              <w:t xml:space="preserve">Camerabewaking add-on</w:t>
+            </w:r>
+          </w:p>
+        </w:tc>
+        <w:tc>
+          <w:tcPr>
+            <w:tcW w:type="dxa" w:w="1400"/>
+            <w:tcBorders>
+              <w:top w:val="single" w:color="CCCCCC" w:sz="1"/>
+              <w:left w:val="single" w:color="CCCCCC" w:sz="1"/>
+              <w:bottom w:val="single" w:color="CCCCCC" w:sz="1"/>
+              <w:right w:val="single" w:color="CCCCCC" w:sz="1"/>
+            </w:tcBorders>
+            <w:shd w:fill="FFF2CC" w:val="clear"/>
+            <w:tcMar>
+              <w:top w:type="dxa" w:w="80"/>
+              <w:left w:type="dxa" w:w="120"/>
+              <w:bottom w:type="dxa" w:w="80"/>
+              <w:right w:type="dxa" w:w="120"/>
+            </w:tcMar>
+          </w:tcPr>
+          <w:p>
+            <w:r>
+              <w:t xml:space="preserve">Open</w:t>
+            </w:r>
+          </w:p>
+        </w:tc>
+        <w:tc>
+          <w:tcPr>
+            <w:tcW w:type="dxa" w:w="4560"/>
+            <w:tcBorders>
+              <w:top w:val="single" w:color="CCCCCC" w:sz="1"/>
+              <w:left w:val="single" w:color="CCCCCC" w:sz="1"/>
+              <w:bottom w:val="single" w:color="CCCCCC" w:sz="1"/>
+              <w:right w:val="single" w:color="CCCCCC" w:sz="1"/>
+            </w:tcBorders>
+            <w:tcMar>
+              <w:top w:type="dxa" w:w="80"/>
+              <w:left w:type="dxa" w:w="120"/>
+              <w:bottom w:type="dxa" w:w="80"/>
+              <w:right w:type="dxa" w:w="120"/>
+            </w:tcMar>
+          </w:tcPr>
+          <w:p>
+            <w:r>
+              <w:t xml:space="preserve">Camera’s als uitbreidingsdienst, net als de slimme thermostaat. Standaard: Reolink (lokaal, geen cloud, scherpe prijs, sterke HA-integratie). Premium: Ubiquiti UniFi Protect. Optioneel Frigate voor lokale AI-persoonsdetectie (Coral-stick, vraagt zwaardere box dan Green). Ring/Nest vermijden (cloud-afhankelijk). Past bij lokaal-en-privacyvriendelijk verhaal. Eerst zelf thuis testen. Toegevoegd: juli 2026</w:t>
+            </w:r>
+          </w:p>
+        </w:tc>
+      </w:tr>
     </w:tbl>
     <w:sectPr>
       <w:pgSz w:w="11906" w:h="16838" w:orient="portrait"/>

</xml_diff>

<commit_message>
Ideeenbus: 10 nieuwe add-on diensten (#8-17): deurbel, sloten, melders, waterlek, verlichting, zonwering, WTW, laadpaal, Shelly, witgoed
</commit_message>
<xml_diff>
--- a/ideenbus.docx
+++ b/ideenbus.docx
@@ -895,6 +895,996 @@
           <w:p>
             <w:r>
               <w:t xml:space="preserve">Camera’s als uitbreidingsdienst, net als de slimme thermostaat. Standaard: Reolink (lokaal, geen cloud, scherpe prijs, sterke HA-integratie). Premium: Ubiquiti UniFi Protect. Optioneel Frigate voor lokale AI-persoonsdetectie (Coral-stick, vraagt zwaardere box dan Green). Ring/Nest vermijden (cloud-afhankelijk). Past bij lokaal-en-privacyvriendelijk verhaal. Eerst zelf thuis testen. Toegevoegd: juli 2026</w:t>
+            </w:r>
+          </w:p>
+        </w:tc>
+      </w:tr>
+      <w:tr>
+        <w:tc>
+          <w:tcPr>
+            <w:tcW w:type="dxa" w:w="600"/>
+            <w:tcBorders>
+              <w:top w:val="single" w:color="CCCCCC" w:sz="1"/>
+              <w:left w:val="single" w:color="CCCCCC" w:sz="1"/>
+              <w:bottom w:val="single" w:color="CCCCCC" w:sz="1"/>
+              <w:right w:val="single" w:color="CCCCCC" w:sz="1"/>
+            </w:tcBorders>
+            <w:tcMar>
+              <w:top w:type="dxa" w:w="80"/>
+              <w:left w:type="dxa" w:w="120"/>
+              <w:bottom w:type="dxa" w:w="80"/>
+              <w:right w:type="dxa" w:w="120"/>
+            </w:tcMar>
+          </w:tcPr>
+          <w:p>
+            <w:r>
+              <w:rPr>
+                <w:b/>
+                <w:bCs/>
+              </w:rPr>
+              <w:t xml:space="preserve">8</w:t>
+            </w:r>
+          </w:p>
+        </w:tc>
+        <w:tc>
+          <w:tcPr>
+            <w:tcW w:type="dxa" w:w="2800"/>
+            <w:tcBorders>
+              <w:top w:val="single" w:color="CCCCCC" w:sz="1"/>
+              <w:left w:val="single" w:color="CCCCCC" w:sz="1"/>
+              <w:bottom w:val="single" w:color="CCCCCC" w:sz="1"/>
+              <w:right w:val="single" w:color="CCCCCC" w:sz="1"/>
+            </w:tcBorders>
+            <w:tcMar>
+              <w:top w:type="dxa" w:w="80"/>
+              <w:left w:type="dxa" w:w="120"/>
+              <w:bottom w:type="dxa" w:w="80"/>
+              <w:right w:type="dxa" w:w="120"/>
+            </w:tcMar>
+          </w:tcPr>
+          <w:p>
+            <w:r>
+              <w:rPr>
+                <w:b/>
+                <w:bCs/>
+              </w:rPr>
+              <w:t xml:space="preserve">Slimme deurbel add-on</w:t>
+            </w:r>
+          </w:p>
+        </w:tc>
+        <w:tc>
+          <w:tcPr>
+            <w:tcW w:type="dxa" w:w="1400"/>
+            <w:tcBorders>
+              <w:top w:val="single" w:color="CCCCCC" w:sz="1"/>
+              <w:left w:val="single" w:color="CCCCCC" w:sz="1"/>
+              <w:bottom w:val="single" w:color="CCCCCC" w:sz="1"/>
+              <w:right w:val="single" w:color="CCCCCC" w:sz="1"/>
+            </w:tcBorders>
+            <w:shd w:fill="FFF2CC" w:val="clear"/>
+            <w:tcMar>
+              <w:top w:type="dxa" w:w="80"/>
+              <w:left w:type="dxa" w:w="120"/>
+              <w:bottom w:type="dxa" w:w="80"/>
+              <w:right w:type="dxa" w:w="120"/>
+            </w:tcMar>
+          </w:tcPr>
+          <w:p>
+            <w:r>
+              <w:t xml:space="preserve">Open</w:t>
+            </w:r>
+          </w:p>
+        </w:tc>
+        <w:tc>
+          <w:tcPr>
+            <w:tcW w:type="dxa" w:w="4560"/>
+            <w:tcBorders>
+              <w:top w:val="single" w:color="CCCCCC" w:sz="1"/>
+              <w:left w:val="single" w:color="CCCCCC" w:sz="1"/>
+              <w:bottom w:val="single" w:color="CCCCCC" w:sz="1"/>
+              <w:right w:val="single" w:color="CCCCCC" w:sz="1"/>
+            </w:tcBorders>
+            <w:tcMar>
+              <w:top w:type="dxa" w:w="80"/>
+              <w:left w:type="dxa" w:w="120"/>
+              <w:bottom w:type="dxa" w:w="80"/>
+              <w:right w:type="dxa" w:w="120"/>
+            </w:tcMar>
+          </w:tcPr>
+          <w:p>
+            <w:r>
+              <w:t xml:space="preserve">Reolink deurbel als natuurlijke uitbreiding op camerabewaking. Zelfde verhaal: lokaal, geen cloudabonnement, melding met beeld in de ThuisBrein-app. Toegevoegd: juli 2026</w:t>
+            </w:r>
+          </w:p>
+        </w:tc>
+      </w:tr>
+      <w:tr>
+        <w:tc>
+          <w:tcPr>
+            <w:tcW w:type="dxa" w:w="600"/>
+            <w:tcBorders>
+              <w:top w:val="single" w:color="CCCCCC" w:sz="1"/>
+              <w:left w:val="single" w:color="CCCCCC" w:sz="1"/>
+              <w:bottom w:val="single" w:color="CCCCCC" w:sz="1"/>
+              <w:right w:val="single" w:color="CCCCCC" w:sz="1"/>
+            </w:tcBorders>
+            <w:tcMar>
+              <w:top w:type="dxa" w:w="80"/>
+              <w:left w:type="dxa" w:w="120"/>
+              <w:bottom w:type="dxa" w:w="80"/>
+              <w:right w:type="dxa" w:w="120"/>
+            </w:tcMar>
+          </w:tcPr>
+          <w:p>
+            <w:r>
+              <w:rPr>
+                <w:b/>
+                <w:bCs/>
+              </w:rPr>
+              <w:t xml:space="preserve">9</w:t>
+            </w:r>
+          </w:p>
+        </w:tc>
+        <w:tc>
+          <w:tcPr>
+            <w:tcW w:type="dxa" w:w="2800"/>
+            <w:tcBorders>
+              <w:top w:val="single" w:color="CCCCCC" w:sz="1"/>
+              <w:left w:val="single" w:color="CCCCCC" w:sz="1"/>
+              <w:bottom w:val="single" w:color="CCCCCC" w:sz="1"/>
+              <w:right w:val="single" w:color="CCCCCC" w:sz="1"/>
+            </w:tcBorders>
+            <w:tcMar>
+              <w:top w:type="dxa" w:w="80"/>
+              <w:left w:type="dxa" w:w="120"/>
+              <w:bottom w:type="dxa" w:w="80"/>
+              <w:right w:type="dxa" w:w="120"/>
+            </w:tcMar>
+          </w:tcPr>
+          <w:p>
+            <w:r>
+              <w:rPr>
+                <w:b/>
+                <w:bCs/>
+              </w:rPr>
+              <w:t xml:space="preserve">Slimme sloten add-on</w:t>
+            </w:r>
+          </w:p>
+        </w:tc>
+        <w:tc>
+          <w:tcPr>
+            <w:tcW w:type="dxa" w:w="1400"/>
+            <w:tcBorders>
+              <w:top w:val="single" w:color="CCCCCC" w:sz="1"/>
+              <w:left w:val="single" w:color="CCCCCC" w:sz="1"/>
+              <w:bottom w:val="single" w:color="CCCCCC" w:sz="1"/>
+              <w:right w:val="single" w:color="CCCCCC" w:sz="1"/>
+            </w:tcBorders>
+            <w:shd w:fill="FFF2CC" w:val="clear"/>
+            <w:tcMar>
+              <w:top w:type="dxa" w:w="80"/>
+              <w:left w:type="dxa" w:w="120"/>
+              <w:bottom w:type="dxa" w:w="80"/>
+              <w:right w:type="dxa" w:w="120"/>
+            </w:tcMar>
+          </w:tcPr>
+          <w:p>
+            <w:r>
+              <w:t xml:space="preserve">Open</w:t>
+            </w:r>
+          </w:p>
+        </w:tc>
+        <w:tc>
+          <w:tcPr>
+            <w:tcW w:type="dxa" w:w="4560"/>
+            <w:tcBorders>
+              <w:top w:val="single" w:color="CCCCCC" w:sz="1"/>
+              <w:left w:val="single" w:color="CCCCCC" w:sz="1"/>
+              <w:bottom w:val="single" w:color="CCCCCC" w:sz="1"/>
+              <w:right w:val="single" w:color="CCCCCC" w:sz="1"/>
+            </w:tcBorders>
+            <w:tcMar>
+              <w:top w:type="dxa" w:w="80"/>
+              <w:left w:type="dxa" w:w="120"/>
+              <w:bottom w:type="dxa" w:w="80"/>
+              <w:right w:type="dxa" w:w="120"/>
+            </w:tcMar>
+          </w:tcPr>
+          <w:p>
+            <w:r>
+              <w:t xml:space="preserve">Nuki als standaard (beste HA-integratie). Bekend terrein vanuit GuestCompass deurtoegang. Combineert met deurbel en camera tot compleet toegangspakket. Toegevoegd: juli 2026</w:t>
+            </w:r>
+          </w:p>
+        </w:tc>
+      </w:tr>
+      <w:tr>
+        <w:tc>
+          <w:tcPr>
+            <w:tcW w:type="dxa" w:w="600"/>
+            <w:tcBorders>
+              <w:top w:val="single" w:color="CCCCCC" w:sz="1"/>
+              <w:left w:val="single" w:color="CCCCCC" w:sz="1"/>
+              <w:bottom w:val="single" w:color="CCCCCC" w:sz="1"/>
+              <w:right w:val="single" w:color="CCCCCC" w:sz="1"/>
+            </w:tcBorders>
+            <w:tcMar>
+              <w:top w:type="dxa" w:w="80"/>
+              <w:left w:type="dxa" w:w="120"/>
+              <w:bottom w:type="dxa" w:w="80"/>
+              <w:right w:type="dxa" w:w="120"/>
+            </w:tcMar>
+          </w:tcPr>
+          <w:p>
+            <w:r>
+              <w:rPr>
+                <w:b/>
+                <w:bCs/>
+              </w:rPr>
+              <w:t xml:space="preserve">10</w:t>
+            </w:r>
+          </w:p>
+        </w:tc>
+        <w:tc>
+          <w:tcPr>
+            <w:tcW w:type="dxa" w:w="2800"/>
+            <w:tcBorders>
+              <w:top w:val="single" w:color="CCCCCC" w:sz="1"/>
+              <w:left w:val="single" w:color="CCCCCC" w:sz="1"/>
+              <w:bottom w:val="single" w:color="CCCCCC" w:sz="1"/>
+              <w:right w:val="single" w:color="CCCCCC" w:sz="1"/>
+            </w:tcBorders>
+            <w:tcMar>
+              <w:top w:type="dxa" w:w="80"/>
+              <w:left w:type="dxa" w:w="120"/>
+              <w:bottom w:type="dxa" w:w="80"/>
+              <w:right w:type="dxa" w:w="120"/>
+            </w:tcMar>
+          </w:tcPr>
+          <w:p>
+            <w:r>
+              <w:rPr>
+                <w:b/>
+                <w:bCs/>
+              </w:rPr>
+              <w:t xml:space="preserve">Rook- en CO-melders gekoppeld</w:t>
+            </w:r>
+          </w:p>
+        </w:tc>
+        <w:tc>
+          <w:tcPr>
+            <w:tcW w:type="dxa" w:w="1400"/>
+            <w:tcBorders>
+              <w:top w:val="single" w:color="CCCCCC" w:sz="1"/>
+              <w:left w:val="single" w:color="CCCCCC" w:sz="1"/>
+              <w:bottom w:val="single" w:color="CCCCCC" w:sz="1"/>
+              <w:right w:val="single" w:color="CCCCCC" w:sz="1"/>
+            </w:tcBorders>
+            <w:shd w:fill="FFF2CC" w:val="clear"/>
+            <w:tcMar>
+              <w:top w:type="dxa" w:w="80"/>
+              <w:left w:type="dxa" w:w="120"/>
+              <w:bottom w:type="dxa" w:w="80"/>
+              <w:right w:type="dxa" w:w="120"/>
+            </w:tcMar>
+          </w:tcPr>
+          <w:p>
+            <w:r>
+              <w:t xml:space="preserve">Open</w:t>
+            </w:r>
+          </w:p>
+        </w:tc>
+        <w:tc>
+          <w:tcPr>
+            <w:tcW w:type="dxa" w:w="4560"/>
+            <w:tcBorders>
+              <w:top w:val="single" w:color="CCCCCC" w:sz="1"/>
+              <w:left w:val="single" w:color="CCCCCC" w:sz="1"/>
+              <w:bottom w:val="single" w:color="CCCCCC" w:sz="1"/>
+              <w:right w:val="single" w:color="CCCCCC" w:sz="1"/>
+            </w:tcBorders>
+            <w:tcMar>
+              <w:top w:type="dxa" w:w="80"/>
+              <w:left w:type="dxa" w:w="120"/>
+              <w:bottom w:type="dxa" w:w="80"/>
+              <w:right w:type="dxa" w:w="120"/>
+            </w:tcMar>
+          </w:tcPr>
+          <w:p>
+            <w:r>
+              <w:t xml:space="preserve">Slimme melders in HA: bij alarm alle lampen aan, rolluiken open, melding op telefoon. Veiligheidsverhaal dat elke klant snapt. Toegevoegd: juli 2026</w:t>
+            </w:r>
+          </w:p>
+        </w:tc>
+      </w:tr>
+      <w:tr>
+        <w:tc>
+          <w:tcPr>
+            <w:tcW w:type="dxa" w:w="600"/>
+            <w:tcBorders>
+              <w:top w:val="single" w:color="CCCCCC" w:sz="1"/>
+              <w:left w:val="single" w:color="CCCCCC" w:sz="1"/>
+              <w:bottom w:val="single" w:color="CCCCCC" w:sz="1"/>
+              <w:right w:val="single" w:color="CCCCCC" w:sz="1"/>
+            </w:tcBorders>
+            <w:tcMar>
+              <w:top w:type="dxa" w:w="80"/>
+              <w:left w:type="dxa" w:w="120"/>
+              <w:bottom w:type="dxa" w:w="80"/>
+              <w:right w:type="dxa" w:w="120"/>
+            </w:tcMar>
+          </w:tcPr>
+          <w:p>
+            <w:r>
+              <w:rPr>
+                <w:b/>
+                <w:bCs/>
+              </w:rPr>
+              <w:t xml:space="preserve">11</w:t>
+            </w:r>
+          </w:p>
+        </w:tc>
+        <w:tc>
+          <w:tcPr>
+            <w:tcW w:type="dxa" w:w="2800"/>
+            <w:tcBorders>
+              <w:top w:val="single" w:color="CCCCCC" w:sz="1"/>
+              <w:left w:val="single" w:color="CCCCCC" w:sz="1"/>
+              <w:bottom w:val="single" w:color="CCCCCC" w:sz="1"/>
+              <w:right w:val="single" w:color="CCCCCC" w:sz="1"/>
+            </w:tcBorders>
+            <w:tcMar>
+              <w:top w:type="dxa" w:w="80"/>
+              <w:left w:type="dxa" w:w="120"/>
+              <w:bottom w:type="dxa" w:w="80"/>
+              <w:right w:type="dxa" w:w="120"/>
+            </w:tcMar>
+          </w:tcPr>
+          <w:p>
+            <w:r>
+              <w:rPr>
+                <w:b/>
+                <w:bCs/>
+              </w:rPr>
+              <w:t xml:space="preserve">Waterlekdetectie</w:t>
+            </w:r>
+          </w:p>
+        </w:tc>
+        <w:tc>
+          <w:tcPr>
+            <w:tcW w:type="dxa" w:w="1400"/>
+            <w:tcBorders>
+              <w:top w:val="single" w:color="CCCCCC" w:sz="1"/>
+              <w:left w:val="single" w:color="CCCCCC" w:sz="1"/>
+              <w:bottom w:val="single" w:color="CCCCCC" w:sz="1"/>
+              <w:right w:val="single" w:color="CCCCCC" w:sz="1"/>
+            </w:tcBorders>
+            <w:shd w:fill="FFF2CC" w:val="clear"/>
+            <w:tcMar>
+              <w:top w:type="dxa" w:w="80"/>
+              <w:left w:type="dxa" w:w="120"/>
+              <w:bottom w:type="dxa" w:w="80"/>
+              <w:right w:type="dxa" w:w="120"/>
+            </w:tcMar>
+          </w:tcPr>
+          <w:p>
+            <w:r>
+              <w:t xml:space="preserve">Open</w:t>
+            </w:r>
+          </w:p>
+        </w:tc>
+        <w:tc>
+          <w:tcPr>
+            <w:tcW w:type="dxa" w:w="4560"/>
+            <w:tcBorders>
+              <w:top w:val="single" w:color="CCCCCC" w:sz="1"/>
+              <w:left w:val="single" w:color="CCCCCC" w:sz="1"/>
+              <w:bottom w:val="single" w:color="CCCCCC" w:sz="1"/>
+              <w:right w:val="single" w:color="CCCCCC" w:sz="1"/>
+            </w:tcBorders>
+            <w:tcMar>
+              <w:top w:type="dxa" w:w="80"/>
+              <w:left w:type="dxa" w:w="120"/>
+              <w:bottom w:type="dxa" w:w="80"/>
+              <w:right w:type="dxa" w:w="120"/>
+            </w:tcMar>
+          </w:tcPr>
+          <w:p>
+            <w:r>
+              <w:t xml:space="preserve">Lekkagesensor bij wasmachine, vaatwasser en cv. Optioneel gekoppelde afsluiter die de hoofdkraan dichtzet. Klein product, groot schadeverhaal. Toegevoegd: juli 2026</w:t>
+            </w:r>
+          </w:p>
+        </w:tc>
+      </w:tr>
+      <w:tr>
+        <w:tc>
+          <w:tcPr>
+            <w:tcW w:type="dxa" w:w="600"/>
+            <w:tcBorders>
+              <w:top w:val="single" w:color="CCCCCC" w:sz="1"/>
+              <w:left w:val="single" w:color="CCCCCC" w:sz="1"/>
+              <w:bottom w:val="single" w:color="CCCCCC" w:sz="1"/>
+              <w:right w:val="single" w:color="CCCCCC" w:sz="1"/>
+            </w:tcBorders>
+            <w:tcMar>
+              <w:top w:type="dxa" w:w="80"/>
+              <w:left w:type="dxa" w:w="120"/>
+              <w:bottom w:type="dxa" w:w="80"/>
+              <w:right w:type="dxa" w:w="120"/>
+            </w:tcMar>
+          </w:tcPr>
+          <w:p>
+            <w:r>
+              <w:rPr>
+                <w:b/>
+                <w:bCs/>
+              </w:rPr>
+              <w:t xml:space="preserve">12</w:t>
+            </w:r>
+          </w:p>
+        </w:tc>
+        <w:tc>
+          <w:tcPr>
+            <w:tcW w:type="dxa" w:w="2800"/>
+            <w:tcBorders>
+              <w:top w:val="single" w:color="CCCCCC" w:sz="1"/>
+              <w:left w:val="single" w:color="CCCCCC" w:sz="1"/>
+              <w:bottom w:val="single" w:color="CCCCCC" w:sz="1"/>
+              <w:right w:val="single" w:color="CCCCCC" w:sz="1"/>
+            </w:tcBorders>
+            <w:tcMar>
+              <w:top w:type="dxa" w:w="80"/>
+              <w:left w:type="dxa" w:w="120"/>
+              <w:bottom w:type="dxa" w:w="80"/>
+              <w:right w:type="dxa" w:w="120"/>
+            </w:tcMar>
+          </w:tcPr>
+          <w:p>
+            <w:r>
+              <w:rPr>
+                <w:b/>
+                <w:bCs/>
+              </w:rPr>
+              <w:t xml:space="preserve">Slimme verlichting add-on</w:t>
+            </w:r>
+          </w:p>
+        </w:tc>
+        <w:tc>
+          <w:tcPr>
+            <w:tcW w:type="dxa" w:w="1400"/>
+            <w:tcBorders>
+              <w:top w:val="single" w:color="CCCCCC" w:sz="1"/>
+              <w:left w:val="single" w:color="CCCCCC" w:sz="1"/>
+              <w:bottom w:val="single" w:color="CCCCCC" w:sz="1"/>
+              <w:right w:val="single" w:color="CCCCCC" w:sz="1"/>
+            </w:tcBorders>
+            <w:shd w:fill="FFF2CC" w:val="clear"/>
+            <w:tcMar>
+              <w:top w:type="dxa" w:w="80"/>
+              <w:left w:type="dxa" w:w="120"/>
+              <w:bottom w:type="dxa" w:w="80"/>
+              <w:right w:type="dxa" w:w="120"/>
+            </w:tcMar>
+          </w:tcPr>
+          <w:p>
+            <w:r>
+              <w:t xml:space="preserve">Open</w:t>
+            </w:r>
+          </w:p>
+        </w:tc>
+        <w:tc>
+          <w:tcPr>
+            <w:tcW w:type="dxa" w:w="4560"/>
+            <w:tcBorders>
+              <w:top w:val="single" w:color="CCCCCC" w:sz="1"/>
+              <w:left w:val="single" w:color="CCCCCC" w:sz="1"/>
+              <w:bottom w:val="single" w:color="CCCCCC" w:sz="1"/>
+              <w:right w:val="single" w:color="CCCCCC" w:sz="1"/>
+            </w:tcBorders>
+            <w:tcMar>
+              <w:top w:type="dxa" w:w="80"/>
+              <w:left w:type="dxa" w:w="120"/>
+              <w:bottom w:type="dxa" w:w="80"/>
+              <w:right w:type="dxa" w:w="120"/>
+            </w:tcMar>
+          </w:tcPr>
+          <w:p>
+            <w:r>
+              <w:t xml:space="preserve">Zigbee/Hue als klassieke instapper tijdens installatiebezoek. Lage drempel, direct wow-effect in de app. Toegevoegd: juli 2026</w:t>
+            </w:r>
+          </w:p>
+        </w:tc>
+      </w:tr>
+      <w:tr>
+        <w:tc>
+          <w:tcPr>
+            <w:tcW w:type="dxa" w:w="600"/>
+            <w:tcBorders>
+              <w:top w:val="single" w:color="CCCCCC" w:sz="1"/>
+              <w:left w:val="single" w:color="CCCCCC" w:sz="1"/>
+              <w:bottom w:val="single" w:color="CCCCCC" w:sz="1"/>
+              <w:right w:val="single" w:color="CCCCCC" w:sz="1"/>
+            </w:tcBorders>
+            <w:tcMar>
+              <w:top w:type="dxa" w:w="80"/>
+              <w:left w:type="dxa" w:w="120"/>
+              <w:bottom w:type="dxa" w:w="80"/>
+              <w:right w:type="dxa" w:w="120"/>
+            </w:tcMar>
+          </w:tcPr>
+          <w:p>
+            <w:r>
+              <w:rPr>
+                <w:b/>
+                <w:bCs/>
+              </w:rPr>
+              <w:t xml:space="preserve">13</w:t>
+            </w:r>
+          </w:p>
+        </w:tc>
+        <w:tc>
+          <w:tcPr>
+            <w:tcW w:type="dxa" w:w="2800"/>
+            <w:tcBorders>
+              <w:top w:val="single" w:color="CCCCCC" w:sz="1"/>
+              <w:left w:val="single" w:color="CCCCCC" w:sz="1"/>
+              <w:bottom w:val="single" w:color="CCCCCC" w:sz="1"/>
+              <w:right w:val="single" w:color="CCCCCC" w:sz="1"/>
+            </w:tcBorders>
+            <w:tcMar>
+              <w:top w:type="dxa" w:w="80"/>
+              <w:left w:type="dxa" w:w="120"/>
+              <w:bottom w:type="dxa" w:w="80"/>
+              <w:right w:type="dxa" w:w="120"/>
+            </w:tcMar>
+          </w:tcPr>
+          <w:p>
+            <w:r>
+              <w:rPr>
+                <w:b/>
+                <w:bCs/>
+              </w:rPr>
+              <w:t xml:space="preserve">Zonwering en screens automatiseren</w:t>
+            </w:r>
+          </w:p>
+        </w:tc>
+        <w:tc>
+          <w:tcPr>
+            <w:tcW w:type="dxa" w:w="1400"/>
+            <w:tcBorders>
+              <w:top w:val="single" w:color="CCCCCC" w:sz="1"/>
+              <w:left w:val="single" w:color="CCCCCC" w:sz="1"/>
+              <w:bottom w:val="single" w:color="CCCCCC" w:sz="1"/>
+              <w:right w:val="single" w:color="CCCCCC" w:sz="1"/>
+            </w:tcBorders>
+            <w:shd w:fill="FFF2CC" w:val="clear"/>
+            <w:tcMar>
+              <w:top w:type="dxa" w:w="80"/>
+              <w:left w:type="dxa" w:w="120"/>
+              <w:bottom w:type="dxa" w:w="80"/>
+              <w:right w:type="dxa" w:w="120"/>
+            </w:tcMar>
+          </w:tcPr>
+          <w:p>
+            <w:r>
+              <w:t xml:space="preserve">Open</w:t>
+            </w:r>
+          </w:p>
+        </w:tc>
+        <w:tc>
+          <w:tcPr>
+            <w:tcW w:type="dxa" w:w="4560"/>
+            <w:tcBorders>
+              <w:top w:val="single" w:color="CCCCCC" w:sz="1"/>
+              <w:left w:val="single" w:color="CCCCCC" w:sz="1"/>
+              <w:bottom w:val="single" w:color="CCCCCC" w:sz="1"/>
+              <w:right w:val="single" w:color="CCCCCC" w:sz="1"/>
+            </w:tcBorders>
+            <w:tcMar>
+              <w:top w:type="dxa" w:w="80"/>
+              <w:left w:type="dxa" w:w="120"/>
+              <w:bottom w:type="dxa" w:w="80"/>
+              <w:right w:type="dxa" w:w="120"/>
+            </w:tcMar>
+          </w:tcPr>
+          <w:p>
+            <w:r>
+              <w:t xml:space="preserve">Screens automatisch dicht bij felle zon = minder aircogebruik. Besparings- en comfortverhaal in een. Somfy/Zigbee-motoren. Toegevoegd: juli 2026</w:t>
+            </w:r>
+          </w:p>
+        </w:tc>
+      </w:tr>
+      <w:tr>
+        <w:tc>
+          <w:tcPr>
+            <w:tcW w:type="dxa" w:w="600"/>
+            <w:tcBorders>
+              <w:top w:val="single" w:color="CCCCCC" w:sz="1"/>
+              <w:left w:val="single" w:color="CCCCCC" w:sz="1"/>
+              <w:bottom w:val="single" w:color="CCCCCC" w:sz="1"/>
+              <w:right w:val="single" w:color="CCCCCC" w:sz="1"/>
+            </w:tcBorders>
+            <w:tcMar>
+              <w:top w:type="dxa" w:w="80"/>
+              <w:left w:type="dxa" w:w="120"/>
+              <w:bottom w:type="dxa" w:w="80"/>
+              <w:right w:type="dxa" w:w="120"/>
+            </w:tcMar>
+          </w:tcPr>
+          <w:p>
+            <w:r>
+              <w:rPr>
+                <w:b/>
+                <w:bCs/>
+              </w:rPr>
+              <w:t xml:space="preserve">14</w:t>
+            </w:r>
+          </w:p>
+        </w:tc>
+        <w:tc>
+          <w:tcPr>
+            <w:tcW w:type="dxa" w:w="2800"/>
+            <w:tcBorders>
+              <w:top w:val="single" w:color="CCCCCC" w:sz="1"/>
+              <w:left w:val="single" w:color="CCCCCC" w:sz="1"/>
+              <w:bottom w:val="single" w:color="CCCCCC" w:sz="1"/>
+              <w:right w:val="single" w:color="CCCCCC" w:sz="1"/>
+            </w:tcBorders>
+            <w:tcMar>
+              <w:top w:type="dxa" w:w="80"/>
+              <w:left w:type="dxa" w:w="120"/>
+              <w:bottom w:type="dxa" w:w="80"/>
+              <w:right w:type="dxa" w:w="120"/>
+            </w:tcMar>
+          </w:tcPr>
+          <w:p>
+            <w:r>
+              <w:rPr>
+                <w:b/>
+                <w:bCs/>
+              </w:rPr>
+              <w:t xml:space="preserve">Ventilatie/WTW koppelen</w:t>
+            </w:r>
+          </w:p>
+        </w:tc>
+        <w:tc>
+          <w:tcPr>
+            <w:tcW w:type="dxa" w:w="1400"/>
+            <w:tcBorders>
+              <w:top w:val="single" w:color="CCCCCC" w:sz="1"/>
+              <w:left w:val="single" w:color="CCCCCC" w:sz="1"/>
+              <w:bottom w:val="single" w:color="CCCCCC" w:sz="1"/>
+              <w:right w:val="single" w:color="CCCCCC" w:sz="1"/>
+            </w:tcBorders>
+            <w:shd w:fill="FFF2CC" w:val="clear"/>
+            <w:tcMar>
+              <w:top w:type="dxa" w:w="80"/>
+              <w:left w:type="dxa" w:w="120"/>
+              <w:bottom w:type="dxa" w:w="80"/>
+              <w:right w:type="dxa" w:w="120"/>
+            </w:tcMar>
+          </w:tcPr>
+          <w:p>
+            <w:r>
+              <w:t xml:space="preserve">Open</w:t>
+            </w:r>
+          </w:p>
+        </w:tc>
+        <w:tc>
+          <w:tcPr>
+            <w:tcW w:type="dxa" w:w="4560"/>
+            <w:tcBorders>
+              <w:top w:val="single" w:color="CCCCCC" w:sz="1"/>
+              <w:left w:val="single" w:color="CCCCCC" w:sz="1"/>
+              <w:bottom w:val="single" w:color="CCCCCC" w:sz="1"/>
+              <w:right w:val="single" w:color="CCCCCC" w:sz="1"/>
+            </w:tcBorders>
+            <w:tcMar>
+              <w:top w:type="dxa" w:w="80"/>
+              <w:left w:type="dxa" w:w="120"/>
+              <w:bottom w:type="dxa" w:w="80"/>
+              <w:right w:type="dxa" w:w="120"/>
+            </w:tcMar>
+          </w:tcPr>
+          <w:p>
+            <w:r>
+              <w:t xml:space="preserve">Itho of Duco CO2-gestuurd via HA. Beter binnenklimaat en energiebesparing. Past bij EP-adviesverhaal. Toegevoegd: juli 2026</w:t>
+            </w:r>
+          </w:p>
+        </w:tc>
+      </w:tr>
+      <w:tr>
+        <w:tc>
+          <w:tcPr>
+            <w:tcW w:type="dxa" w:w="600"/>
+            <w:tcBorders>
+              <w:top w:val="single" w:color="CCCCCC" w:sz="1"/>
+              <w:left w:val="single" w:color="CCCCCC" w:sz="1"/>
+              <w:bottom w:val="single" w:color="CCCCCC" w:sz="1"/>
+              <w:right w:val="single" w:color="CCCCCC" w:sz="1"/>
+            </w:tcBorders>
+            <w:tcMar>
+              <w:top w:type="dxa" w:w="80"/>
+              <w:left w:type="dxa" w:w="120"/>
+              <w:bottom w:type="dxa" w:w="80"/>
+              <w:right w:type="dxa" w:w="120"/>
+            </w:tcMar>
+          </w:tcPr>
+          <w:p>
+            <w:r>
+              <w:rPr>
+                <w:b/>
+                <w:bCs/>
+              </w:rPr>
+              <w:t xml:space="preserve">15</w:t>
+            </w:r>
+          </w:p>
+        </w:tc>
+        <w:tc>
+          <w:tcPr>
+            <w:tcW w:type="dxa" w:w="2800"/>
+            <w:tcBorders>
+              <w:top w:val="single" w:color="CCCCCC" w:sz="1"/>
+              <w:left w:val="single" w:color="CCCCCC" w:sz="1"/>
+              <w:bottom w:val="single" w:color="CCCCCC" w:sz="1"/>
+              <w:right w:val="single" w:color="CCCCCC" w:sz="1"/>
+            </w:tcBorders>
+            <w:tcMar>
+              <w:top w:type="dxa" w:w="80"/>
+              <w:left w:type="dxa" w:w="120"/>
+              <w:bottom w:type="dxa" w:w="80"/>
+              <w:right w:type="dxa" w:w="120"/>
+            </w:tcMar>
+          </w:tcPr>
+          <w:p>
+            <w:r>
+              <w:rPr>
+                <w:b/>
+                <w:bCs/>
+              </w:rPr>
+              <w:t xml:space="preserve">Slimme laadpaal-sturing</w:t>
+            </w:r>
+          </w:p>
+        </w:tc>
+        <w:tc>
+          <w:tcPr>
+            <w:tcW w:type="dxa" w:w="1400"/>
+            <w:tcBorders>
+              <w:top w:val="single" w:color="CCCCCC" w:sz="1"/>
+              <w:left w:val="single" w:color="CCCCCC" w:sz="1"/>
+              <w:bottom w:val="single" w:color="CCCCCC" w:sz="1"/>
+              <w:right w:val="single" w:color="CCCCCC" w:sz="1"/>
+            </w:tcBorders>
+            <w:shd w:fill="FFF2CC" w:val="clear"/>
+            <w:tcMar>
+              <w:top w:type="dxa" w:w="80"/>
+              <w:left w:type="dxa" w:w="120"/>
+              <w:bottom w:type="dxa" w:w="80"/>
+              <w:right w:type="dxa" w:w="120"/>
+            </w:tcMar>
+          </w:tcPr>
+          <w:p>
+            <w:r>
+              <w:t xml:space="preserve">Open</w:t>
+            </w:r>
+          </w:p>
+        </w:tc>
+        <w:tc>
+          <w:tcPr>
+            <w:tcW w:type="dxa" w:w="4560"/>
+            <w:tcBorders>
+              <w:top w:val="single" w:color="CCCCCC" w:sz="1"/>
+              <w:left w:val="single" w:color="CCCCCC" w:sz="1"/>
+              <w:bottom w:val="single" w:color="CCCCCC" w:sz="1"/>
+              <w:right w:val="single" w:color="CCCCCC" w:sz="1"/>
+            </w:tcBorders>
+            <w:tcMar>
+              <w:top w:type="dxa" w:w="80"/>
+              <w:left w:type="dxa" w:w="120"/>
+              <w:bottom w:type="dxa" w:w="80"/>
+              <w:right w:type="dxa" w:w="120"/>
+            </w:tcMar>
+          </w:tcPr>
+          <w:p>
+            <w:r>
+              <w:t xml:space="preserve">Laden op zonne-overschot of goedkope uren. Dichtst bij de energiekern van ThuisBrein; sterke besparingscase voor EV-rijders. Toegevoegd: juli 2026</w:t>
+            </w:r>
+          </w:p>
+        </w:tc>
+      </w:tr>
+      <w:tr>
+        <w:tc>
+          <w:tcPr>
+            <w:tcW w:type="dxa" w:w="600"/>
+            <w:tcBorders>
+              <w:top w:val="single" w:color="CCCCCC" w:sz="1"/>
+              <w:left w:val="single" w:color="CCCCCC" w:sz="1"/>
+              <w:bottom w:val="single" w:color="CCCCCC" w:sz="1"/>
+              <w:right w:val="single" w:color="CCCCCC" w:sz="1"/>
+            </w:tcBorders>
+            <w:tcMar>
+              <w:top w:type="dxa" w:w="80"/>
+              <w:left w:type="dxa" w:w="120"/>
+              <w:bottom w:type="dxa" w:w="80"/>
+              <w:right w:type="dxa" w:w="120"/>
+            </w:tcMar>
+          </w:tcPr>
+          <w:p>
+            <w:r>
+              <w:rPr>
+                <w:b/>
+                <w:bCs/>
+              </w:rPr>
+              <w:t xml:space="preserve">16</w:t>
+            </w:r>
+          </w:p>
+        </w:tc>
+        <w:tc>
+          <w:tcPr>
+            <w:tcW w:type="dxa" w:w="2800"/>
+            <w:tcBorders>
+              <w:top w:val="single" w:color="CCCCCC" w:sz="1"/>
+              <w:left w:val="single" w:color="CCCCCC" w:sz="1"/>
+              <w:bottom w:val="single" w:color="CCCCCC" w:sz="1"/>
+              <w:right w:val="single" w:color="CCCCCC" w:sz="1"/>
+            </w:tcBorders>
+            <w:tcMar>
+              <w:top w:type="dxa" w:w="80"/>
+              <w:left w:type="dxa" w:w="120"/>
+              <w:bottom w:type="dxa" w:w="80"/>
+              <w:right w:type="dxa" w:w="120"/>
+            </w:tcMar>
+          </w:tcPr>
+          <w:p>
+            <w:r>
+              <w:rPr>
+                <w:b/>
+                <w:bCs/>
+              </w:rPr>
+              <w:t xml:space="preserve">Shelly-metingen per groep</w:t>
+            </w:r>
+          </w:p>
+        </w:tc>
+        <w:tc>
+          <w:tcPr>
+            <w:tcW w:type="dxa" w:w="1400"/>
+            <w:tcBorders>
+              <w:top w:val="single" w:color="CCCCCC" w:sz="1"/>
+              <w:left w:val="single" w:color="CCCCCC" w:sz="1"/>
+              <w:bottom w:val="single" w:color="CCCCCC" w:sz="1"/>
+              <w:right w:val="single" w:color="CCCCCC" w:sz="1"/>
+            </w:tcBorders>
+            <w:shd w:fill="FFF2CC" w:val="clear"/>
+            <w:tcMar>
+              <w:top w:type="dxa" w:w="80"/>
+              <w:left w:type="dxa" w:w="120"/>
+              <w:bottom w:type="dxa" w:w="80"/>
+              <w:right w:type="dxa" w:w="120"/>
+            </w:tcMar>
+          </w:tcPr>
+          <w:p>
+            <w:r>
+              <w:t xml:space="preserve">Open</w:t>
+            </w:r>
+          </w:p>
+        </w:tc>
+        <w:tc>
+          <w:tcPr>
+            <w:tcW w:type="dxa" w:w="4560"/>
+            <w:tcBorders>
+              <w:top w:val="single" w:color="CCCCCC" w:sz="1"/>
+              <w:left w:val="single" w:color="CCCCCC" w:sz="1"/>
+              <w:bottom w:val="single" w:color="CCCCCC" w:sz="1"/>
+              <w:right w:val="single" w:color="CCCCCC" w:sz="1"/>
+            </w:tcBorders>
+            <w:tcMar>
+              <w:top w:type="dxa" w:w="80"/>
+              <w:left w:type="dxa" w:w="120"/>
+              <w:bottom w:type="dxa" w:w="80"/>
+              <w:right w:type="dxa" w:w="120"/>
+            </w:tcMar>
+          </w:tcPr>
+          <w:p>
+            <w:r>
+              <w:t xml:space="preserve">Meting per stroomgroep in de meterkast: zichtbaar welk apparaat de stroomvreter is. Mooie opstap naar vervolgadvies. Toegevoegd: juli 2026</w:t>
+            </w:r>
+          </w:p>
+        </w:tc>
+      </w:tr>
+      <w:tr>
+        <w:tc>
+          <w:tcPr>
+            <w:tcW w:type="dxa" w:w="600"/>
+            <w:tcBorders>
+              <w:top w:val="single" w:color="CCCCCC" w:sz="1"/>
+              <w:left w:val="single" w:color="CCCCCC" w:sz="1"/>
+              <w:bottom w:val="single" w:color="CCCCCC" w:sz="1"/>
+              <w:right w:val="single" w:color="CCCCCC" w:sz="1"/>
+            </w:tcBorders>
+            <w:tcMar>
+              <w:top w:type="dxa" w:w="80"/>
+              <w:left w:type="dxa" w:w="120"/>
+              <w:bottom w:type="dxa" w:w="80"/>
+              <w:right w:type="dxa" w:w="120"/>
+            </w:tcMar>
+          </w:tcPr>
+          <w:p>
+            <w:r>
+              <w:rPr>
+                <w:b/>
+                <w:bCs/>
+              </w:rPr>
+              <w:t xml:space="preserve">17</w:t>
+            </w:r>
+          </w:p>
+        </w:tc>
+        <w:tc>
+          <w:tcPr>
+            <w:tcW w:type="dxa" w:w="2800"/>
+            <w:tcBorders>
+              <w:top w:val="single" w:color="CCCCCC" w:sz="1"/>
+              <w:left w:val="single" w:color="CCCCCC" w:sz="1"/>
+              <w:bottom w:val="single" w:color="CCCCCC" w:sz="1"/>
+              <w:right w:val="single" w:color="CCCCCC" w:sz="1"/>
+            </w:tcBorders>
+            <w:tcMar>
+              <w:top w:type="dxa" w:w="80"/>
+              <w:left w:type="dxa" w:w="120"/>
+              <w:bottom w:type="dxa" w:w="80"/>
+              <w:right w:type="dxa" w:w="120"/>
+            </w:tcMar>
+          </w:tcPr>
+          <w:p>
+            <w:r>
+              <w:rPr>
+                <w:b/>
+                <w:bCs/>
+              </w:rPr>
+              <w:t xml:space="preserve">Slim stopcontact voor witgoed</w:t>
+            </w:r>
+          </w:p>
+        </w:tc>
+        <w:tc>
+          <w:tcPr>
+            <w:tcW w:type="dxa" w:w="1400"/>
+            <w:tcBorders>
+              <w:top w:val="single" w:color="CCCCCC" w:sz="1"/>
+              <w:left w:val="single" w:color="CCCCCC" w:sz="1"/>
+              <w:bottom w:val="single" w:color="CCCCCC" w:sz="1"/>
+              <w:right w:val="single" w:color="CCCCCC" w:sz="1"/>
+            </w:tcBorders>
+            <w:shd w:fill="FFF2CC" w:val="clear"/>
+            <w:tcMar>
+              <w:top w:type="dxa" w:w="80"/>
+              <w:left w:type="dxa" w:w="120"/>
+              <w:bottom w:type="dxa" w:w="80"/>
+              <w:right w:type="dxa" w:w="120"/>
+            </w:tcMar>
+          </w:tcPr>
+          <w:p>
+            <w:r>
+              <w:t xml:space="preserve">Open</w:t>
+            </w:r>
+          </w:p>
+        </w:tc>
+        <w:tc>
+          <w:tcPr>
+            <w:tcW w:type="dxa" w:w="4560"/>
+            <w:tcBorders>
+              <w:top w:val="single" w:color="CCCCCC" w:sz="1"/>
+              <w:left w:val="single" w:color="CCCCCC" w:sz="1"/>
+              <w:bottom w:val="single" w:color="CCCCCC" w:sz="1"/>
+              <w:right w:val="single" w:color="CCCCCC" w:sz="1"/>
+            </w:tcBorders>
+            <w:tcMar>
+              <w:top w:type="dxa" w:w="80"/>
+              <w:left w:type="dxa" w:w="120"/>
+              <w:bottom w:type="dxa" w:w="80"/>
+              <w:right w:type="dxa" w:w="120"/>
+            </w:tcMar>
+          </w:tcPr>
+          <w:p>
+            <w:r>
+              <w:t xml:space="preserve">Vaatwasser/wasmachine automatisch draaien op zonne-overschot of goedkope uren. Goedkoopste besparings-add-on die er is. Toegevoegd: juli 2026</w:t>
             </w:r>
           </w:p>
         </w:tc>

</xml_diff>

<commit_message>
Ideeenbus: #18 intake foto gateway, #19 learning Nest koppeltraject
</commit_message>
<xml_diff>
--- a/ideenbus.docx
+++ b/ideenbus.docx
@@ -1885,6 +1885,204 @@
           <w:p>
             <w:r>
               <w:t xml:space="preserve">Vaatwasser/wasmachine automatisch draaien op zonne-overschot of goedkope uren. Goedkoopste besparings-add-on die er is. Toegevoegd: juli 2026</w:t>
+            </w:r>
+          </w:p>
+        </w:tc>
+      </w:tr>
+      <w:tr>
+        <w:tc>
+          <w:tcPr>
+            <w:tcW w:type="dxa" w:w="600"/>
+            <w:tcBorders>
+              <w:top w:val="single" w:color="CCCCCC" w:sz="1"/>
+              <w:left w:val="single" w:color="CCCCCC" w:sz="1"/>
+              <w:bottom w:val="single" w:color="CCCCCC" w:sz="1"/>
+              <w:right w:val="single" w:color="CCCCCC" w:sz="1"/>
+            </w:tcBorders>
+            <w:tcMar>
+              <w:top w:type="dxa" w:w="80"/>
+              <w:left w:type="dxa" w:w="120"/>
+              <w:bottom w:type="dxa" w:w="80"/>
+              <w:right w:type="dxa" w:w="120"/>
+            </w:tcMar>
+          </w:tcPr>
+          <w:p>
+            <w:r>
+              <w:rPr>
+                <w:b/>
+                <w:bCs/>
+              </w:rPr>
+              <w:t xml:space="preserve">18</w:t>
+            </w:r>
+          </w:p>
+        </w:tc>
+        <w:tc>
+          <w:tcPr>
+            <w:tcW w:type="dxa" w:w="2800"/>
+            <w:tcBorders>
+              <w:top w:val="single" w:color="CCCCCC" w:sz="1"/>
+              <w:left w:val="single" w:color="CCCCCC" w:sz="1"/>
+              <w:bottom w:val="single" w:color="CCCCCC" w:sz="1"/>
+              <w:right w:val="single" w:color="CCCCCC" w:sz="1"/>
+            </w:tcBorders>
+            <w:tcMar>
+              <w:top w:type="dxa" w:w="80"/>
+              <w:left w:type="dxa" w:w="120"/>
+              <w:bottom w:type="dxa" w:w="80"/>
+              <w:right w:type="dxa" w:w="120"/>
+            </w:tcMar>
+          </w:tcPr>
+          <w:p>
+            <w:r>
+              <w:rPr>
+                <w:b/>
+                <w:bCs/>
+              </w:rPr>
+              <w:t xml:space="preserve">Intake: foto omvormer/gateway vooraf</w:t>
+            </w:r>
+          </w:p>
+        </w:tc>
+        <w:tc>
+          <w:tcPr>
+            <w:tcW w:type="dxa" w:w="1400"/>
+            <w:tcBorders>
+              <w:top w:val="single" w:color="CCCCCC" w:sz="1"/>
+              <w:left w:val="single" w:color="CCCCCC" w:sz="1"/>
+              <w:bottom w:val="single" w:color="CCCCCC" w:sz="1"/>
+              <w:right w:val="single" w:color="CCCCCC" w:sz="1"/>
+            </w:tcBorders>
+            <w:shd w:fill="FFF2CC" w:val="clear"/>
+            <w:tcMar>
+              <w:top w:type="dxa" w:w="80"/>
+              <w:left w:type="dxa" w:w="120"/>
+              <w:bottom w:type="dxa" w:w="80"/>
+              <w:right w:type="dxa" w:w="120"/>
+            </w:tcMar>
+          </w:tcPr>
+          <w:p>
+            <w:r>
+              <w:t xml:space="preserve">Open</w:t>
+            </w:r>
+          </w:p>
+        </w:tc>
+        <w:tc>
+          <w:tcPr>
+            <w:tcW w:type="dxa" w:w="4560"/>
+            <w:tcBorders>
+              <w:top w:val="single" w:color="CCCCCC" w:sz="1"/>
+              <w:left w:val="single" w:color="CCCCCC" w:sz="1"/>
+              <w:bottom w:val="single" w:color="CCCCCC" w:sz="1"/>
+              <w:right w:val="single" w:color="CCCCCC" w:sz="1"/>
+            </w:tcBorders>
+            <w:tcMar>
+              <w:top w:type="dxa" w:w="80"/>
+              <w:left w:type="dxa" w:w="120"/>
+              <w:bottom w:type="dxa" w:w="80"/>
+              <w:right w:type="dxa" w:w="120"/>
+            </w:tcMar>
+          </w:tcPr>
+          <w:p>
+            <w:r>
+              <w:t xml:space="preserve">Vraag bij de Woningcheck/intake standaard een foto van omvormer, gateway en meterkast. Gateway-variant bepaalt wat kan: Enphase Envoy-S Standard = alleen productie uitlezen (lokaal, prima in HA), geen verbruiksmeting en geen sturing. Metered + IQ System Controller nodig voor sturing/batterij. Zo beloof je nooit iets dat de hardware niet aankan. Fallback bij geen sturing: load shifting. Learning bij broer, juli 2026</w:t>
+            </w:r>
+          </w:p>
+        </w:tc>
+      </w:tr>
+      <w:tr>
+        <w:tc>
+          <w:tcPr>
+            <w:tcW w:type="dxa" w:w="600"/>
+            <w:tcBorders>
+              <w:top w:val="single" w:color="CCCCCC" w:sz="1"/>
+              <w:left w:val="single" w:color="CCCCCC" w:sz="1"/>
+              <w:bottom w:val="single" w:color="CCCCCC" w:sz="1"/>
+              <w:right w:val="single" w:color="CCCCCC" w:sz="1"/>
+            </w:tcBorders>
+            <w:tcMar>
+              <w:top w:type="dxa" w:w="80"/>
+              <w:left w:type="dxa" w:w="120"/>
+              <w:bottom w:type="dxa" w:w="80"/>
+              <w:right w:type="dxa" w:w="120"/>
+            </w:tcMar>
+          </w:tcPr>
+          <w:p>
+            <w:r>
+              <w:rPr>
+                <w:b/>
+                <w:bCs/>
+              </w:rPr>
+              <w:t xml:space="preserve">19</w:t>
+            </w:r>
+          </w:p>
+        </w:tc>
+        <w:tc>
+          <w:tcPr>
+            <w:tcW w:type="dxa" w:w="2800"/>
+            <w:tcBorders>
+              <w:top w:val="single" w:color="CCCCCC" w:sz="1"/>
+              <w:left w:val="single" w:color="CCCCCC" w:sz="1"/>
+              <w:bottom w:val="single" w:color="CCCCCC" w:sz="1"/>
+              <w:right w:val="single" w:color="CCCCCC" w:sz="1"/>
+            </w:tcBorders>
+            <w:tcMar>
+              <w:top w:type="dxa" w:w="80"/>
+              <w:left w:type="dxa" w:w="120"/>
+              <w:bottom w:type="dxa" w:w="80"/>
+              <w:right w:type="dxa" w:w="120"/>
+            </w:tcMar>
+          </w:tcPr>
+          <w:p>
+            <w:r>
+              <w:rPr>
+                <w:b/>
+                <w:bCs/>
+              </w:rPr>
+              <w:t xml:space="preserve">Learning: Google Nest koppeltraject</w:t>
+            </w:r>
+          </w:p>
+        </w:tc>
+        <w:tc>
+          <w:tcPr>
+            <w:tcW w:type="dxa" w:w="1400"/>
+            <w:tcBorders>
+              <w:top w:val="single" w:color="CCCCCC" w:sz="1"/>
+              <w:left w:val="single" w:color="CCCCCC" w:sz="1"/>
+              <w:bottom w:val="single" w:color="CCCCCC" w:sz="1"/>
+              <w:right w:val="single" w:color="CCCCCC" w:sz="1"/>
+            </w:tcBorders>
+            <w:shd w:fill="FFF2CC" w:val="clear"/>
+            <w:tcMar>
+              <w:top w:type="dxa" w:w="80"/>
+              <w:left w:type="dxa" w:w="120"/>
+              <w:bottom w:type="dxa" w:w="80"/>
+              <w:right w:type="dxa" w:w="120"/>
+            </w:tcMar>
+          </w:tcPr>
+          <w:p>
+            <w:r>
+              <w:t xml:space="preserve">Open</w:t>
+            </w:r>
+          </w:p>
+        </w:tc>
+        <w:tc>
+          <w:tcPr>
+            <w:tcW w:type="dxa" w:w="4560"/>
+            <w:tcBorders>
+              <w:top w:val="single" w:color="CCCCCC" w:sz="1"/>
+              <w:left w:val="single" w:color="CCCCCC" w:sz="1"/>
+              <w:bottom w:val="single" w:color="CCCCCC" w:sz="1"/>
+              <w:right w:val="single" w:color="CCCCCC" w:sz="1"/>
+            </w:tcBorders>
+            <w:tcMar>
+              <w:top w:type="dxa" w:w="80"/>
+              <w:left w:type="dxa" w:w="120"/>
+              <w:bottom w:type="dxa" w:w="80"/>
+              <w:right w:type="dxa" w:w="120"/>
+            </w:tcMar>
+          </w:tcPr>
+          <w:p>
+            <w:r>
+              <w:t xml:space="preserve">Nest koppelen aan HA is lang traject: Google Device Access Console + Cloud Console, eenmalig $5, veel account-valkuilen. Reken 45+ min extra of adviseer lokaal alternatief (Plugwise/Nuki: koppelt in 5 min). Verkoopargument voor lokale merken. Learning bij broer, juli 2026</w:t>
             </w:r>
           </w:p>
         </w:tc>

</xml_diff>

<commit_message>
Ideeenbus: #20 verzendmodel pre-provisioning + zelf aansluiten
</commit_message>
<xml_diff>
--- a/ideenbus.docx
+++ b/ideenbus.docx
@@ -2083,6 +2083,105 @@
           <w:p>
             <w:r>
               <w:t xml:space="preserve">Nest koppelen aan HA is lang traject: Google Device Access Console + Cloud Console, eenmalig $5, veel account-valkuilen. Reken 45+ min extra of adviseer lokaal alternatief (Plugwise/Nuki: koppelt in 5 min). Verkoopargument voor lokale merken. Learning bij broer, juli 2026</w:t>
+            </w:r>
+          </w:p>
+        </w:tc>
+      </w:tr>
+      <w:tr>
+        <w:tc>
+          <w:tcPr>
+            <w:tcW w:type="dxa" w:w="600"/>
+            <w:tcBorders>
+              <w:top w:val="single" w:color="CCCCCC" w:sz="1"/>
+              <w:left w:val="single" w:color="CCCCCC" w:sz="1"/>
+              <w:bottom w:val="single" w:color="CCCCCC" w:sz="1"/>
+              <w:right w:val="single" w:color="CCCCCC" w:sz="1"/>
+            </w:tcBorders>
+            <w:tcMar>
+              <w:top w:type="dxa" w:w="80"/>
+              <w:left w:type="dxa" w:w="120"/>
+              <w:bottom w:type="dxa" w:w="80"/>
+              <w:right w:type="dxa" w:w="120"/>
+            </w:tcMar>
+          </w:tcPr>
+          <w:p>
+            <w:r>
+              <w:rPr>
+                <w:b/>
+                <w:bCs/>
+              </w:rPr>
+              <w:t xml:space="preserve">20</w:t>
+            </w:r>
+          </w:p>
+        </w:tc>
+        <w:tc>
+          <w:tcPr>
+            <w:tcW w:type="dxa" w:w="2800"/>
+            <w:tcBorders>
+              <w:top w:val="single" w:color="CCCCCC" w:sz="1"/>
+              <w:left w:val="single" w:color="CCCCCC" w:sz="1"/>
+              <w:bottom w:val="single" w:color="CCCCCC" w:sz="1"/>
+              <w:right w:val="single" w:color="CCCCCC" w:sz="1"/>
+            </w:tcBorders>
+            <w:tcMar>
+              <w:top w:type="dxa" w:w="80"/>
+              <w:left w:type="dxa" w:w="120"/>
+              <w:bottom w:type="dxa" w:w="80"/>
+              <w:right w:type="dxa" w:w="120"/>
+            </w:tcMar>
+          </w:tcPr>
+          <w:p>
+            <w:r>
+              <w:rPr>
+                <w:b/>
+                <w:bCs/>
+              </w:rPr>
+              <w:t xml:space="preserve">Verzendmodel: pre-provisioning + zelf aansluiten</w:t>
+            </w:r>
+          </w:p>
+        </w:tc>
+        <w:tc>
+          <w:tcPr>
+            <w:tcW w:type="dxa" w:w="1400"/>
+            <w:tcBorders>
+              <w:top w:val="single" w:color="CCCCCC" w:sz="1"/>
+              <w:left w:val="single" w:color="CCCCCC" w:sz="1"/>
+              <w:bottom w:val="single" w:color="CCCCCC" w:sz="1"/>
+              <w:right w:val="single" w:color="CCCCCC" w:sz="1"/>
+            </w:tcBorders>
+            <w:shd w:fill="FFF2CC" w:val="clear"/>
+            <w:tcMar>
+              <w:top w:type="dxa" w:w="80"/>
+              <w:left w:type="dxa" w:w="120"/>
+              <w:bottom w:type="dxa" w:w="80"/>
+              <w:right w:type="dxa" w:w="120"/>
+            </w:tcMar>
+          </w:tcPr>
+          <w:p>
+            <w:r>
+              <w:t xml:space="preserve">Open</w:t>
+            </w:r>
+          </w:p>
+        </w:tc>
+        <w:tc>
+          <w:tcPr>
+            <w:tcW w:type="dxa" w:w="4560"/>
+            <w:tcBorders>
+              <w:top w:val="single" w:color="CCCCCC" w:sz="1"/>
+              <w:left w:val="single" w:color="CCCCCC" w:sz="1"/>
+              <w:bottom w:val="single" w:color="CCCCCC" w:sz="1"/>
+              <w:right w:val="single" w:color="CCCCCC" w:sz="1"/>
+            </w:tcBorders>
+            <w:tcMar>
+              <w:top w:type="dxa" w:w="80"/>
+              <w:left w:type="dxa" w:w="120"/>
+              <w:bottom w:type="dxa" w:w="80"/>
+              <w:right w:type="dxa" w:w="120"/>
+            </w:tcMar>
+          </w:tcPr>
+          <w:p>
+            <w:r>
+              <w:t xml:space="preserve">Nieuwe standaard werkwijze. Intake via online videocall (verplicht bij niet-inperson): merk omvormer/airco/thermostaat, foto's meterkast en gateway, wifi-gegevens. Op de werkbank: HA Green volledig pre-provisioned vanaf golden image (integraties, HACS, ThuisBrein-dashboard, automations, Tailscale met key expiry uit, Zigbee-apparaten al gepaird en benoemd). Klant krijgt doos toegestuurd: uitpakken, stroom, kabel naar router - klaar. Laatste stappen (klant-accounts koppelen, apparaten op IP, finetuning) doe ik op afstand via Tailscale, eventueel met videocall bij activatie. Rijden alleen nog als het in de buurt is. Bezoektijd van dagdeel naar nul; landelijk werkgebied ipv regionaal. Toegevoegd: juli 2026</w:t>
             </w:r>
           </w:p>
         </w:tc>

</xml_diff>

<commit_message>
Ideeenbus: #21 prijsopslag bij met-extra-stap systemen
</commit_message>
<xml_diff>
--- a/ideenbus.docx
+++ b/ideenbus.docx
@@ -2182,6 +2182,105 @@
           <w:p>
             <w:r>
               <w:t xml:space="preserve">Nieuwe standaard werkwijze. Intake via online videocall (verplicht bij niet-inperson): merk omvormer/airco/thermostaat, foto's meterkast en gateway, wifi-gegevens. Op de werkbank: HA Green volledig pre-provisioned vanaf golden image (integraties, HACS, ThuisBrein-dashboard, automations, Tailscale met key expiry uit, Zigbee-apparaten al gepaird en benoemd). Klant krijgt doos toegestuurd: uitpakken, stroom, kabel naar router - klaar. Laatste stappen (klant-accounts koppelen, apparaten op IP, finetuning) doe ik op afstand via Tailscale, eventueel met videocall bij activatie. Rijden alleen nog als het in de buurt is. Bezoektijd van dagdeel naar nul; landelijk werkgebied ipv regionaal. Toegevoegd: juli 2026</w:t>
+            </w:r>
+          </w:p>
+        </w:tc>
+      </w:tr>
+      <w:tr>
+        <w:tc>
+          <w:tcPr>
+            <w:tcW w:type="dxa" w:w="600"/>
+            <w:tcBorders>
+              <w:top w:val="single" w:color="CCCCCC" w:sz="1"/>
+              <w:left w:val="single" w:color="CCCCCC" w:sz="1"/>
+              <w:bottom w:val="single" w:color="CCCCCC" w:sz="1"/>
+              <w:right w:val="single" w:color="CCCCCC" w:sz="1"/>
+            </w:tcBorders>
+            <w:tcMar>
+              <w:top w:type="dxa" w:w="80"/>
+              <w:left w:type="dxa" w:w="120"/>
+              <w:bottom w:type="dxa" w:w="80"/>
+              <w:right w:type="dxa" w:w="120"/>
+            </w:tcMar>
+          </w:tcPr>
+          <w:p>
+            <w:r>
+              <w:rPr>
+                <w:b/>
+                <w:bCs/>
+              </w:rPr>
+              <w:t xml:space="preserve">21</w:t>
+            </w:r>
+          </w:p>
+        </w:tc>
+        <w:tc>
+          <w:tcPr>
+            <w:tcW w:type="dxa" w:w="2800"/>
+            <w:tcBorders>
+              <w:top w:val="single" w:color="CCCCCC" w:sz="1"/>
+              <w:left w:val="single" w:color="CCCCCC" w:sz="1"/>
+              <w:bottom w:val="single" w:color="CCCCCC" w:sz="1"/>
+              <w:right w:val="single" w:color="CCCCCC" w:sz="1"/>
+            </w:tcBorders>
+            <w:tcMar>
+              <w:top w:type="dxa" w:w="80"/>
+              <w:left w:type="dxa" w:w="120"/>
+              <w:bottom w:type="dxa" w:w="80"/>
+              <w:right w:type="dxa" w:w="120"/>
+            </w:tcMar>
+          </w:tcPr>
+          <w:p>
+            <w:r>
+              <w:rPr>
+                <w:b/>
+                <w:bCs/>
+              </w:rPr>
+              <w:t xml:space="preserve">Prijsopslag bij 'met extra stap'-systemen</w:t>
+            </w:r>
+          </w:p>
+        </w:tc>
+        <w:tc>
+          <w:tcPr>
+            <w:tcW w:type="dxa" w:w="1400"/>
+            <w:tcBorders>
+              <w:top w:val="single" w:color="CCCCCC" w:sz="1"/>
+              <w:left w:val="single" w:color="CCCCCC" w:sz="1"/>
+              <w:bottom w:val="single" w:color="CCCCCC" w:sz="1"/>
+              <w:right w:val="single" w:color="CCCCCC" w:sz="1"/>
+            </w:tcBorders>
+            <w:shd w:fill="FFF2CC" w:val="clear"/>
+            <w:tcMar>
+              <w:top w:type="dxa" w:w="80"/>
+              <w:left w:type="dxa" w:w="120"/>
+              <w:bottom w:type="dxa" w:w="80"/>
+              <w:right w:type="dxa" w:w="120"/>
+            </w:tcMar>
+          </w:tcPr>
+          <w:p>
+            <w:r>
+              <w:t xml:space="preserve">Open</w:t>
+            </w:r>
+          </w:p>
+        </w:tc>
+        <w:tc>
+          <w:tcPr>
+            <w:tcW w:type="dxa" w:w="4560"/>
+            <w:tcBorders>
+              <w:top w:val="single" w:color="CCCCCC" w:sz="1"/>
+              <w:left w:val="single" w:color="CCCCCC" w:sz="1"/>
+              <w:bottom w:val="single" w:color="CCCCCC" w:sz="1"/>
+              <w:right w:val="single" w:color="CCCCCC" w:sz="1"/>
+            </w:tcBorders>
+            <w:tcMar>
+              <w:top w:type="dxa" w:w="80"/>
+              <w:left w:type="dxa" w:w="120"/>
+              <w:bottom w:type="dxa" w:w="80"/>
+              <w:right w:type="dxa" w:w="120"/>
+            </w:tcMar>
+          </w:tcPr>
+          <w:p>
+            <w:r>
+              <w:t xml:space="preserve">Systemen die op de compatibiliteitslijst 'Met extra stap' hebben (extra hardware zoals ESPHome-module of Modbus-adapter, of extra configuratiewerk) kosten aantoonbaar meer installatietijd dan direct koppelbare merken. Overwegen: vaste opslag per 'extra stap'-koppeling (bijv. +€50-75) of dit meenemen in de intake-offerte. Voorkomt dat lastige merken de marge opeten. Toegevoegd: juli 2026</w:t>
             </w:r>
           </w:p>
         </w:tc>

</xml_diff>